<commit_message>
docs(requirements): bring the auth .docx to v1.2 (welcome redesign)
Mirrors the Requirements/auth-onboarding.md v1.2 amendment from #264 in
PadelJam_Auth_Onboarding_Requirements.docx: version line and changelog,
the amendment note, the first-install flag row, the Welcome intro, the
4.1 layout rows (incl. a new Secondary CTA row), the 4.2 card copy, AU-02
and the build prompt. Old text is struck through and tagged
"(amended, welcome redesign)", as in the .md.

Co-Authored-By: Claude Opus 5.5 <noreply@anthropic.com>
</commit_message>
<xml_diff>
--- a/Requirements/PadelJam_Auth_Onboarding_Requirements.docx
+++ b/Requirements/PadelJam_Auth_Onboarding_Requirements.docx
@@ -56,12 +56,24 @@
           <w:szCs w:val="22"/>
           <w:rtl w:val="0"/>
         </w:rPr>
-        <w:t xml:space="preserve">Version 1.1 • May 2026 • Onboarding simplified — single Jammer+ gate + push prompt</w:t>
-      </w:r>
-      <w:r>
-        <w:rPr>
-          <w:rtl w:val="0"/>
-        </w:rPr>
+        <w:t xml:space="preserve">Version 1.2 • October 2026 • Welcome screen amended by the Welcome redesign (2026-10-04)</w:t>
+      </w:r>
+    </w:p>
+    <w:p>
+      <w:pPr>
+        <w:spacing w:after="200" w:lineRule="auto"/>
+        <w:rPr/>
+      </w:pPr>
+      <w:r>
+        <w:rPr>
+          <w:i w:val="1"/>
+          <w:iCs w:val="1"/>
+          <w:color w:val="777777"/>
+          <w:sz w:val="22"/>
+          <w:szCs w:val="22"/>
+          <w:rtl w:val="0"/>
+        </w:rPr>
+        <w:t xml:space="preserve">Changelog — v1.2 (2026-10-04): Welcome becomes a three-slide pager with two buttons, Get started and Sign in, both leading to Sign In / Sign Up; see the amendment note below. v1.1 (May 2026): onboarding simplified — single Jammer+ gate + push prompt.</w:t>
       </w:r>
     </w:p>
     <w:p>
@@ -95,6 +107,180 @@
         <w:rPr>
           <w:rtl w:val="0"/>
         </w:rPr>
+      </w:r>
+    </w:p>
+    <w:p>
+      <w:pPr>
+        <w:spacing w:after="200" w:lineRule="auto"/>
+        <w:rPr/>
+      </w:pPr>
+      <w:r>
+        <w:rPr>
+          <w:b w:val="1"/>
+          <w:bCs w:val="1"/>
+          <w:sz w:val="22"/>
+          <w:szCs w:val="22"/>
+          <w:rtl w:val="0"/>
+        </w:rPr>
+        <w:t xml:space="preserve">Amended 2026-10-04 by the Welcome redesign</w:t>
+      </w:r>
+      <w:r>
+        <w:rPr>
+          <w:sz w:val="22"/>
+          <w:szCs w:val="22"/>
+          <w:rtl w:val="0"/>
+        </w:rPr>
+        <w:t xml:space="preserve"> (the Welcome screens in the “PJAM - Mobile App” Figma file, which replace the placeholder carousel first built under UX-AUTH-01). Only the Welcome screen and its first-install flag change; Splash, Sign In / Sign Up and Onboarding are as before. Rows and paragraphs marked </w:t>
+      </w:r>
+      <w:r>
+        <w:rPr>
+          <w:i w:val="1"/>
+          <w:iCs w:val="1"/>
+          <w:sz w:val="22"/>
+          <w:szCs w:val="22"/>
+          <w:rtl w:val="0"/>
+        </w:rPr>
+        <w:t xml:space="preserve">(amended, welcome redesign)</w:t>
+      </w:r>
+      <w:r>
+        <w:rPr>
+          <w:sz w:val="22"/>
+          <w:szCs w:val="22"/>
+          <w:rtl w:val="0"/>
+        </w:rPr>
+        <w:t xml:space="preserve"> carry the outcome. In short:</w:t>
+      </w:r>
+    </w:p>
+    <w:p>
+      <w:pPr>
+        <w:ind w:left="360"/>
+        <w:spacing w:after="200" w:lineRule="auto"/>
+        <w:rPr/>
+      </w:pPr>
+      <w:r>
+        <w:rPr>
+          <w:sz w:val="22"/>
+          <w:szCs w:val="22"/>
+          <w:rtl w:val="0"/>
+        </w:rPr>
+        <w:t xml:space="preserve">• </w:t>
+      </w:r>
+      <w:r>
+        <w:rPr>
+          <w:b w:val="1"/>
+          <w:bCs w:val="1"/>
+          <w:sz w:val="22"/>
+          <w:szCs w:val="22"/>
+          <w:rtl w:val="0"/>
+        </w:rPr>
+        <w:t xml:space="preserve">Two buttons, not one.</w:t>
+      </w:r>
+      <w:r>
+        <w:rPr>
+          <w:sz w:val="22"/>
+          <w:szCs w:val="22"/>
+          <w:rtl w:val="0"/>
+        </w:rPr>
+        <w:t xml:space="preserve"> Under the copy, every slide shows “Get started” (primary) and “Sign in” (secondary). They are the same destination: each sets the first-install flag and replaces Welcome with the combined Sign In / Sign Up screen (“Login or Sign Up”). There is no separate returning-user screen, and Create your account is not a target because it needs a live session.</w:t>
+      </w:r>
+    </w:p>
+    <w:p>
+      <w:pPr>
+        <w:ind w:left="360"/>
+        <w:spacing w:after="200" w:lineRule="auto"/>
+        <w:rPr/>
+      </w:pPr>
+      <w:r>
+        <w:rPr>
+          <w:sz w:val="22"/>
+          <w:szCs w:val="22"/>
+          <w:rtl w:val="0"/>
+        </w:rPr>
+        <w:t xml:space="preserve">• </w:t>
+      </w:r>
+      <w:r>
+        <w:rPr>
+          <w:b w:val="1"/>
+          <w:bCs w:val="1"/>
+          <w:sz w:val="22"/>
+          <w:szCs w:val="22"/>
+          <w:rtl w:val="0"/>
+        </w:rPr>
+        <w:t xml:space="preserve">One pager, three slides.</w:t>
+      </w:r>
+      <w:r>
+        <w:rPr>
+          <w:sz w:val="22"/>
+          <w:szCs w:val="22"/>
+          <w:rtl w:val="0"/>
+        </w:rPr>
+        <w:t xml:space="preserve"> An edge-to-edge mascot illustration fills the top of the screen, under a fixed light sheet with rounded top corners. Swiping anywhere on the illustration or the copy moves to the next slide: the illustration and the copy slide together, while the sheet, the page dots and the two buttons stay put.</w:t>
+      </w:r>
+    </w:p>
+    <w:p>
+      <w:pPr>
+        <w:ind w:left="360"/>
+        <w:spacing w:after="200" w:lineRule="auto"/>
+        <w:rPr/>
+      </w:pPr>
+      <w:r>
+        <w:rPr>
+          <w:sz w:val="22"/>
+          <w:szCs w:val="22"/>
+          <w:rtl w:val="0"/>
+        </w:rPr>
+        <w:t xml:space="preserve">• </w:t>
+      </w:r>
+      <w:r>
+        <w:rPr>
+          <w:b w:val="1"/>
+          <w:bCs w:val="1"/>
+          <w:sz w:val="22"/>
+          <w:szCs w:val="22"/>
+          <w:rtl w:val="0"/>
+        </w:rPr>
+        <w:t xml:space="preserve">The copy is final</w:t>
+      </w:r>
+      <w:r>
+        <w:rPr>
+          <w:sz w:val="22"/>
+          <w:szCs w:val="22"/>
+          <w:rtl w:val="0"/>
+        </w:rPr>
+        <w:t xml:space="preserve"> (English in the Card rows of section 04; pt-PT and pt-BR live in the app’s string catalogue), replacing the “final copy TBD” placeholders.</w:t>
+      </w:r>
+    </w:p>
+    <w:p>
+      <w:pPr>
+        <w:ind w:left="360"/>
+        <w:spacing w:after="200" w:lineRule="auto"/>
+        <w:rPr/>
+      </w:pPr>
+      <w:r>
+        <w:rPr>
+          <w:sz w:val="22"/>
+          <w:szCs w:val="22"/>
+          <w:rtl w:val="0"/>
+        </w:rPr>
+        <w:t xml:space="preserve">• </w:t>
+      </w:r>
+      <w:r>
+        <w:rPr>
+          <w:b w:val="1"/>
+          <w:bCs w:val="1"/>
+          <w:sz w:val="22"/>
+          <w:szCs w:val="22"/>
+          <w:rtl w:val="0"/>
+        </w:rPr>
+        <w:t xml:space="preserve">The flag is the same flag.</w:t>
+      </w:r>
+      <w:r>
+        <w:rPr>
+          <w:sz w:val="22"/>
+          <w:szCs w:val="22"/>
+          <w:rtl w:val="0"/>
+        </w:rPr>
+        <w:t xml:space="preserve"> Only who sets it changes: either button now sets hasSeenWelcome. Devices that already have it keep skipping Welcome.</w:t>
       </w:r>
     </w:p>
     <w:tbl>
@@ -1903,12 +2089,68 @@
                 <w:szCs w:val="20"/>
                 <w:rtl w:val="0"/>
               </w:rPr>
-              <w:t xml:space="preserve">A local flag (e.g. AsyncStorage / localStorage hasSeenWelcome) is set the first time the user dismisses Welcome with Start now. Logging out does not clear it; only a full app reinstall does.</w:t>
-            </w:r>
-            <w:r>
-              <w:rPr>
-                <w:rtl w:val="0"/>
-              </w:rPr>
+              <w:t xml:space="preserve">A local flag (e.g. AsyncStorage / localStorage hasSeenWelcome) is set the first time the user dismisses Welcome with </w:t>
+            </w:r>
+            <w:r>
+              <w:rPr>
+                <w:strike w:val="1"/>
+                <w:sz w:val="20"/>
+                <w:szCs w:val="20"/>
+                <w:rtl w:val="0"/>
+              </w:rPr>
+              <w:t xml:space="preserve">Start now</w:t>
+            </w:r>
+            <w:r>
+              <w:rPr>
+                <w:sz w:val="20"/>
+                <w:szCs w:val="20"/>
+                <w:rtl w:val="0"/>
+              </w:rPr>
+              <w:t xml:space="preserve"> </w:t>
+            </w:r>
+            <w:r>
+              <w:rPr>
+                <w:i w:val="1"/>
+                <w:iCs w:val="1"/>
+                <w:sz w:val="20"/>
+                <w:szCs w:val="20"/>
+                <w:rtl w:val="0"/>
+              </w:rPr>
+              <w:t xml:space="preserve">(amended, welcome redesign)</w:t>
+            </w:r>
+            <w:r>
+              <w:rPr>
+                <w:sz w:val="20"/>
+                <w:szCs w:val="20"/>
+                <w:rtl w:val="0"/>
+              </w:rPr>
+              <w:t xml:space="preserve"> either button, Get started or Sign in. Logging out does not clear it; only a full app reinstall does.</w:t>
+            </w:r>
+            <w:r>
+              <w:rPr>
+                <w:sz w:val="20"/>
+                <w:szCs w:val="20"/>
+                <w:rtl w:val="0"/>
+              </w:rPr>
+              <w:t xml:space="preserve"> </w:t>
+            </w:r>
+            <w:r>
+              <w:rPr>
+                <w:i w:val="1"/>
+                <w:iCs w:val="1"/>
+                <w:sz w:val="20"/>
+                <w:szCs w:val="20"/>
+                <w:rtl w:val="0"/>
+              </w:rPr>
+              <w:t xml:space="preserve">(amended)</w:t>
+            </w:r>
+            <w:r>
+              <w:rPr>
+                <w:sz w:val="20"/>
+                <w:szCs w:val="20"/>
+                <w:rtl w:val="0"/>
+              </w:rPr>
+              <w:t xml:space="preserve"> If the flag cannot be saved, the button still goes on to Sign In / Sign Up; Welcome then shows again on the next launch.</w:t>
             </w:r>
           </w:p>
         </w:tc>
@@ -1944,6 +2186,7 @@
       </w:pPr>
       <w:r>
         <w:rPr>
+          <w:strike w:val="1"/>
           <w:sz w:val="22"/>
           <w:szCs w:val="22"/>
           <w:rtl w:val="0"/>
@@ -1952,8 +2195,29 @@
       </w:r>
       <w:r>
         <w:rPr>
-          <w:rtl w:val="0"/>
-        </w:rPr>
+          <w:sz w:val="22"/>
+          <w:szCs w:val="22"/>
+          <w:rtl w:val="0"/>
+        </w:rPr>
+        <w:t xml:space="preserve"> </w:t>
+      </w:r>
+      <w:r>
+        <w:rPr>
+          <w:i w:val="1"/>
+          <w:iCs w:val="1"/>
+          <w:sz w:val="22"/>
+          <w:szCs w:val="22"/>
+          <w:rtl w:val="0"/>
+        </w:rPr>
+        <w:t xml:space="preserve">(amended, welcome redesign)</w:t>
+      </w:r>
+      <w:r>
+        <w:rPr>
+          <w:sz w:val="22"/>
+          <w:szCs w:val="22"/>
+          <w:rtl w:val="0"/>
+        </w:rPr>
+        <w:t xml:space="preserve"> A short, three-slide horizontal pager that introduces the app on first install. Reached from Splash; never shown again on the device once the user has tapped Get started or Sign in (or completed a sign-in by any other means).</w:t>
       </w:r>
     </w:p>
     <w:tbl>
@@ -2093,6 +2357,7 @@
             </w:pPr>
             <w:r>
               <w:rPr>
+                <w:strike w:val="1"/>
                 <w:sz w:val="20"/>
                 <w:szCs w:val="20"/>
                 <w:rtl w:val="0"/>
@@ -2101,8 +2366,29 @@
             </w:r>
             <w:r>
               <w:rPr>
-                <w:rtl w:val="0"/>
-              </w:rPr>
+                <w:sz w:val="20"/>
+                <w:szCs w:val="20"/>
+                <w:rtl w:val="0"/>
+              </w:rPr>
+              <w:t xml:space="preserve"> </w:t>
+            </w:r>
+            <w:r>
+              <w:rPr>
+                <w:i w:val="1"/>
+                <w:iCs w:val="1"/>
+                <w:sz w:val="20"/>
+                <w:szCs w:val="20"/>
+                <w:rtl w:val="0"/>
+              </w:rPr>
+              <w:t xml:space="preserve">(amended, welcome redesign)</w:t>
+            </w:r>
+            <w:r>
+              <w:rPr>
+                <w:sz w:val="20"/>
+                <w:szCs w:val="20"/>
+                <w:rtl w:val="0"/>
+              </w:rPr>
+              <w:t xml:space="preserve"> The whole screen. The illustration runs edge to edge across the top, under the status bar. A fixed light sheet with rounded top corners rises over the lower part of the illustration and holds the copy, the page dots and the two buttons.</w:t>
             </w:r>
           </w:p>
         </w:tc>
@@ -2172,6 +2458,7 @@
             </w:pPr>
             <w:r>
               <w:rPr>
+                <w:strike w:val="1"/>
                 <w:sz w:val="20"/>
                 <w:szCs w:val="20"/>
                 <w:rtl w:val="0"/>
@@ -2180,8 +2467,29 @@
             </w:r>
             <w:r>
               <w:rPr>
-                <w:rtl w:val="0"/>
-              </w:rPr>
+                <w:sz w:val="20"/>
+                <w:szCs w:val="20"/>
+                <w:rtl w:val="0"/>
+              </w:rPr>
+              <w:t xml:space="preserve"> </w:t>
+            </w:r>
+            <w:r>
+              <w:rPr>
+                <w:i w:val="1"/>
+                <w:iCs w:val="1"/>
+                <w:sz w:val="20"/>
+                <w:szCs w:val="20"/>
+                <w:rtl w:val="0"/>
+              </w:rPr>
+              <w:t xml:space="preserve">(amended)</w:t>
+            </w:r>
+            <w:r>
+              <w:rPr>
+                <w:sz w:val="20"/>
+                <w:szCs w:val="20"/>
+                <w:rtl w:val="0"/>
+              </w:rPr>
+              <w:t xml:space="preserve"> The illustration takes the upper part of the screen; the sheet keeps its own height, so the illustration grows or shrinks with the device. It is decorative and hidden from assistive technology.</w:t>
             </w:r>
           </w:p>
         </w:tc>
@@ -2251,6 +2559,7 @@
             </w:pPr>
             <w:r>
               <w:rPr>
+                <w:strike w:val="1"/>
                 <w:sz w:val="20"/>
                 <w:szCs w:val="20"/>
                 <w:rtl w:val="0"/>
@@ -2259,8 +2568,29 @@
             </w:r>
             <w:r>
               <w:rPr>
-                <w:rtl w:val="0"/>
-              </w:rPr>
+                <w:sz w:val="20"/>
+                <w:szCs w:val="20"/>
+                <w:rtl w:val="0"/>
+              </w:rPr>
+              <w:t xml:space="preserve"> </w:t>
+            </w:r>
+            <w:r>
+              <w:rPr>
+                <w:i w:val="1"/>
+                <w:iCs w:val="1"/>
+                <w:sz w:val="20"/>
+                <w:szCs w:val="20"/>
+                <w:rtl w:val="0"/>
+              </w:rPr>
+              <w:t xml:space="preserve">(amended)</w:t>
+            </w:r>
+            <w:r>
+              <w:rPr>
+                <w:sz w:val="20"/>
+                <w:szCs w:val="20"/>
+                <w:rtl w:val="0"/>
+              </w:rPr>
+              <w:t xml:space="preserve"> A bold, centred headline of up to two lines. Two lines are always reserved, so the illustration and the buttons stay put between slides and between languages. Copy in the Card rows below.</w:t>
             </w:r>
           </w:p>
         </w:tc>
@@ -2334,12 +2664,42 @@
                 <w:szCs w:val="20"/>
                 <w:rtl w:val="0"/>
               </w:rPr>
-              <w:t xml:space="preserve">Two lines of supporting copy below the title. Final copy TBD.</w:t>
-            </w:r>
-            <w:r>
-              <w:rPr>
-                <w:rtl w:val="0"/>
-              </w:rPr>
+              <w:t xml:space="preserve">Two lines of supporting copy below the title. </w:t>
+            </w:r>
+            <w:r>
+              <w:rPr>
+                <w:strike w:val="1"/>
+                <w:sz w:val="20"/>
+                <w:szCs w:val="20"/>
+                <w:rtl w:val="0"/>
+              </w:rPr>
+              <w:t xml:space="preserve">Final copy TBD.</w:t>
+            </w:r>
+            <w:r>
+              <w:rPr>
+                <w:sz w:val="20"/>
+                <w:szCs w:val="20"/>
+                <w:rtl w:val="0"/>
+              </w:rPr>
+              <w:t xml:space="preserve"> </w:t>
+            </w:r>
+            <w:r>
+              <w:rPr>
+                <w:i w:val="1"/>
+                <w:iCs w:val="1"/>
+                <w:sz w:val="20"/>
+                <w:szCs w:val="20"/>
+                <w:rtl w:val="0"/>
+              </w:rPr>
+              <w:t xml:space="preserve">(amended)</w:t>
+            </w:r>
+            <w:r>
+              <w:rPr>
+                <w:sz w:val="20"/>
+                <w:szCs w:val="20"/>
+                <w:rtl w:val="0"/>
+              </w:rPr>
+              <w:t xml:space="preserve"> Centred, with two lines reserved as for the title. Copy in the Card rows below.</w:t>
             </w:r>
           </w:p>
         </w:tc>
@@ -2417,8 +2777,29 @@
             </w:r>
             <w:r>
               <w:rPr>
-                <w:rtl w:val="0"/>
-              </w:rPr>
+                <w:sz w:val="20"/>
+                <w:szCs w:val="20"/>
+                <w:rtl w:val="0"/>
+              </w:rPr>
+              <w:t xml:space="preserve"> </w:t>
+            </w:r>
+            <w:r>
+              <w:rPr>
+                <w:i w:val="1"/>
+                <w:iCs w:val="1"/>
+                <w:sz w:val="20"/>
+                <w:szCs w:val="20"/>
+                <w:rtl w:val="0"/>
+              </w:rPr>
+              <w:t xml:space="preserve">(amended)</w:t>
+            </w:r>
+            <w:r>
+              <w:rPr>
+                <w:sz w:val="20"/>
+                <w:szCs w:val="20"/>
+                <w:rtl w:val="0"/>
+              </w:rPr>
+              <w:t xml:space="preserve"> The dots sit between the copy and the buttons and do not move. Swiping starts anywhere on the illustration or the copy; the illustration and the copy slide together while the sheet, the dots and the buttons stay in place, and the pager does not bounce past the first or last slide.</w:t>
             </w:r>
           </w:p>
         </w:tc>
@@ -2488,6 +2869,7 @@
             </w:pPr>
             <w:r>
               <w:rPr>
+                <w:strike w:val="1"/>
                 <w:sz w:val="20"/>
                 <w:szCs w:val="20"/>
                 <w:rtl w:val="0"/>
@@ -2496,8 +2878,116 @@
             </w:r>
             <w:r>
               <w:rPr>
-                <w:rtl w:val="0"/>
-              </w:rPr>
+                <w:sz w:val="20"/>
+                <w:szCs w:val="20"/>
+                <w:rtl w:val="0"/>
+              </w:rPr>
+              <w:t xml:space="preserve"> </w:t>
+            </w:r>
+            <w:r>
+              <w:rPr>
+                <w:i w:val="1"/>
+                <w:iCs w:val="1"/>
+                <w:sz w:val="20"/>
+                <w:szCs w:val="20"/>
+                <w:rtl w:val="0"/>
+              </w:rPr>
+              <w:t xml:space="preserve">(amended, welcome redesign)</w:t>
+            </w:r>
+            <w:r>
+              <w:rPr>
+                <w:sz w:val="20"/>
+                <w:szCs w:val="20"/>
+                <w:rtl w:val="0"/>
+              </w:rPr>
+              <w:t xml:space="preserve"> A full-width “Get started” button (filled, the primary style) under the dots. Visible on every slide. Tapping it sets the first-install flag and replaces Welcome with Sign In / Sign Up, regardless of which slide is active.</w:t>
+            </w:r>
+          </w:p>
+        </w:tc>
+      </w:tr>
+      <w:tr>
+        <w:trPr>
+          <w:cantSplit w:val="0"/>
+          <w:tblHeader w:val="0"/>
+        </w:trPr>
+        <w:tc>
+          <w:tcPr>
+            <w:tcW w:w="2600.0" w:type="dxa"/>
+            <w:tcBorders>
+              <w:top w:color="cccccc" w:space="0" w:sz="4" w:val="single"/>
+              <w:left w:color="cccccc" w:space="0" w:sz="4" w:val="single"/>
+              <w:bottom w:color="cccccc" w:space="0" w:sz="4" w:val="single"/>
+              <w:right w:color="cccccc" w:space="0" w:sz="4" w:val="single"/>
+            </w:tcBorders>
+            <w:shd w:fill="fafafa" w:val="clear"/>
+            <w:tcMar>
+              <w:top w:w="80.0" w:type="dxa"/>
+              <w:left w:w="120.0" w:type="dxa"/>
+              <w:bottom w:w="80.0" w:type="dxa"/>
+              <w:right w:w="120.0" w:type="dxa"/>
+            </w:tcMar>
+          </w:tcPr>
+          <w:p>
+            <w:pPr>
+              <w:rPr/>
+            </w:pPr>
+            <w:r>
+              <w:rPr>
+                <w:b w:val="1"/>
+                <w:bCs w:val="1"/>
+                <w:sz w:val="20"/>
+                <w:szCs w:val="20"/>
+                <w:rtl w:val="0"/>
+              </w:rPr>
+              <w:t xml:space="preserve">Secondary CTA</w:t>
+            </w:r>
+            <w:r>
+              <w:rPr>
+                <w:sz w:val="20"/>
+                <w:szCs w:val="20"/>
+                <w:rtl w:val="0"/>
+              </w:rPr>
+              <w:t xml:space="preserve"> </w:t>
+            </w:r>
+            <w:r>
+              <w:rPr>
+                <w:i w:val="1"/>
+                <w:iCs w:val="1"/>
+                <w:sz w:val="20"/>
+                <w:szCs w:val="20"/>
+                <w:rtl w:val="0"/>
+              </w:rPr>
+              <w:t xml:space="preserve">(amended, welcome redesign)</w:t>
+            </w:r>
+          </w:p>
+        </w:tc>
+        <w:tc>
+          <w:tcPr>
+            <w:tcW w:w="6760.0" w:type="dxa"/>
+            <w:tcBorders>
+              <w:top w:color="cccccc" w:space="0" w:sz="4" w:val="single"/>
+              <w:left w:color="cccccc" w:space="0" w:sz="4" w:val="single"/>
+              <w:bottom w:color="cccccc" w:space="0" w:sz="4" w:val="single"/>
+              <w:right w:color="cccccc" w:space="0" w:sz="4" w:val="single"/>
+            </w:tcBorders>
+            <w:tcMar>
+              <w:top w:w="80.0" w:type="dxa"/>
+              <w:left w:w="120.0" w:type="dxa"/>
+              <w:bottom w:w="80.0" w:type="dxa"/>
+              <w:right w:w="120.0" w:type="dxa"/>
+            </w:tcMar>
+          </w:tcPr>
+          <w:p>
+            <w:pPr>
+              <w:rPr/>
+            </w:pPr>
+            <w:r>
+              <w:rPr>
+                <w:sz w:val="20"/>
+                <w:szCs w:val="20"/>
+                <w:rtl w:val="0"/>
+              </w:rPr>
+              <w:t xml:space="preserve">A full-width “Sign in” button (the secondary, light style) directly under “Get started”. Visible on every slide. It does exactly what “Get started” does: sets the first-install flag and replaces Welcome with the same combined Sign In / Sign Up screen. There is no separate returning-user screen.</w:t>
             </w:r>
           </w:p>
         </w:tc>
@@ -2651,6 +3141,7 @@
             </w:pPr>
             <w:r>
               <w:rPr>
+                <w:strike w:val="1"/>
                 <w:sz w:val="20"/>
                 <w:szCs w:val="20"/>
                 <w:rtl w:val="0"/>
@@ -2659,8 +3150,29 @@
             </w:r>
             <w:r>
               <w:rPr>
-                <w:rtl w:val="0"/>
-              </w:rPr>
+                <w:sz w:val="20"/>
+                <w:szCs w:val="20"/>
+                <w:rtl w:val="0"/>
+              </w:rPr>
+              <w:t xml:space="preserve"> </w:t>
+            </w:r>
+            <w:r>
+              <w:rPr>
+                <w:i w:val="1"/>
+                <w:iCs w:val="1"/>
+                <w:sz w:val="20"/>
+                <w:szCs w:val="20"/>
+                <w:rtl w:val="0"/>
+              </w:rPr>
+              <w:t xml:space="preserve">(amended, welcome redesign)</w:t>
+            </w:r>
+            <w:r>
+              <w:rPr>
+                <w:sz w:val="20"/>
+                <w:szCs w:val="20"/>
+                <w:rtl w:val="0"/>
+              </w:rPr>
+              <w:t xml:space="preserve"> Theme: nearby games. Title “Find games near you”. Body “Take a peek at nearby padel courts. Your next match might be closer than you think.” Illustration: a fox.</w:t>
             </w:r>
           </w:p>
         </w:tc>
@@ -2730,6 +3242,7 @@
             </w:pPr>
             <w:r>
               <w:rPr>
+                <w:strike w:val="1"/>
                 <w:sz w:val="20"/>
                 <w:szCs w:val="20"/>
                 <w:rtl w:val="0"/>
@@ -2738,8 +3251,29 @@
             </w:r>
             <w:r>
               <w:rPr>
-                <w:rtl w:val="0"/>
-              </w:rPr>
+                <w:sz w:val="20"/>
+                <w:szCs w:val="20"/>
+                <w:rtl w:val="0"/>
+              </w:rPr>
+              <w:t xml:space="preserve"> </w:t>
+            </w:r>
+            <w:r>
+              <w:rPr>
+                <w:i w:val="1"/>
+                <w:iCs w:val="1"/>
+                <w:sz w:val="20"/>
+                <w:szCs w:val="20"/>
+                <w:rtl w:val="0"/>
+              </w:rPr>
+              <w:t xml:space="preserve">(amended)</w:t>
+            </w:r>
+            <w:r>
+              <w:rPr>
+                <w:sz w:val="20"/>
+                <w:szCs w:val="20"/>
+                <w:rtl w:val="0"/>
+              </w:rPr>
+              <w:t xml:space="preserve"> Theme: creating and joining games. Title “Create or join in seconds”. Body “Start a session or reserve your spot in just a few taps. Then… relax until game time.” Illustration: a bear.</w:t>
             </w:r>
           </w:p>
         </w:tc>
@@ -2809,6 +3343,7 @@
             </w:pPr>
             <w:r>
               <w:rPr>
+                <w:strike w:val="1"/>
                 <w:sz w:val="20"/>
                 <w:szCs w:val="20"/>
                 <w:rtl w:val="0"/>
@@ -2817,8 +3352,29 @@
             </w:r>
             <w:r>
               <w:rPr>
-                <w:rtl w:val="0"/>
-              </w:rPr>
+                <w:sz w:val="20"/>
+                <w:szCs w:val="20"/>
+                <w:rtl w:val="0"/>
+              </w:rPr>
+              <w:t xml:space="preserve"> </w:t>
+            </w:r>
+            <w:r>
+              <w:rPr>
+                <w:i w:val="1"/>
+                <w:iCs w:val="1"/>
+                <w:sz w:val="20"/>
+                <w:szCs w:val="20"/>
+                <w:rtl w:val="0"/>
+              </w:rPr>
+              <w:t xml:space="preserve">(amended)</w:t>
+            </w:r>
+            <w:r>
+              <w:rPr>
+                <w:sz w:val="20"/>
+                <w:szCs w:val="20"/>
+                <w:rtl w:val="0"/>
+              </w:rPr>
+              <w:t xml:space="preserve"> Theme: the padel community. Title “Explore your padel community”. Body “Find players at your level, so you can stop carrying the whole game.” Illustration: a turtle and a rabbit.</w:t>
             </w:r>
           </w:p>
         </w:tc>
@@ -2888,6 +3444,7 @@
             </w:pPr>
             <w:r>
               <w:rPr>
+                <w:strike w:val="1"/>
                 <w:sz w:val="20"/>
                 <w:szCs w:val="20"/>
                 <w:rtl w:val="0"/>
@@ -2896,8 +3453,29 @@
             </w:r>
             <w:r>
               <w:rPr>
-                <w:rtl w:val="0"/>
-              </w:rPr>
+                <w:sz w:val="20"/>
+                <w:szCs w:val="20"/>
+                <w:rtl w:val="0"/>
+              </w:rPr>
+              <w:t xml:space="preserve"> </w:t>
+            </w:r>
+            <w:r>
+              <w:rPr>
+                <w:i w:val="1"/>
+                <w:iCs w:val="1"/>
+                <w:sz w:val="20"/>
+                <w:szCs w:val="20"/>
+                <w:rtl w:val="0"/>
+              </w:rPr>
+              <w:t xml:space="preserve">(amended, welcome redesign)</w:t>
+            </w:r>
+            <w:r>
+              <w:rPr>
+                <w:sz w:val="20"/>
+                <w:szCs w:val="20"/>
+                <w:rtl w:val="0"/>
+              </w:rPr>
+              <w:t xml:space="preserve"> The slide structure is fixed (illustration / title / body, then the dots and the two CTAs); this doc only locks the structure. The English copy above is final and ships. The Portuguese versions (pt-PT, pt-BR) are in the app’s string catalogue; the three illustrations are the mascot artwork from the design file.</w:t>
             </w:r>
           </w:p>
         </w:tc>
@@ -11054,16 +11632,29 @@
             </w:pPr>
             <w:r>
               <w:rPr>
-                <w:sz w:val="20"/>
-                <w:szCs w:val="20"/>
-                <w:rtl w:val="0"/>
-              </w:rPr>
-              <w:t xml:space="preserve">Welcome screen is shown only on first install; a 3-card horizontal carousel with “Start now” CTA.</w:t>
-            </w:r>
-            <w:r>
-              <w:rPr>
-                <w:rtl w:val="0"/>
-              </w:rPr>
+                <w:i w:val="1"/>
+                <w:iCs w:val="1"/>
+                <w:sz w:val="20"/>
+                <w:szCs w:val="20"/>
+                <w:rtl w:val="0"/>
+              </w:rPr>
+              <w:t xml:space="preserve">(amended 2026-10-04)</w:t>
+            </w:r>
+            <w:r>
+              <w:rPr>
+                <w:sz w:val="20"/>
+                <w:szCs w:val="20"/>
+                <w:rtl w:val="0"/>
+              </w:rPr>
+              <w:t xml:space="preserve"> </w:t>
+            </w:r>
+            <w:r>
+              <w:rPr>
+                <w:sz w:val="20"/>
+                <w:szCs w:val="20"/>
+                <w:rtl w:val="0"/>
+              </w:rPr>
+              <w:t xml:space="preserve">Welcome screen is shown only on first install; a 3-slide horizontal pager (illustration, title, body) over a fixed sheet with the page dots and two CTAs, “Get started” and “Sign in”, both leading to Sign In / Sign Up.</w:t>
             </w:r>
           </w:p>
         </w:tc>
@@ -11130,12 +11721,7 @@
                 <w:szCs w:val="20"/>
                 <w:rtl w:val="0"/>
               </w:rPr>
-              <w:t xml:space="preserve">Local flag persisted across logout.</w:t>
-            </w:r>
-            <w:r>
-              <w:rPr>
-                <w:rtl w:val="0"/>
-              </w:rPr>
+              <w:t xml:space="preserve">Local flag persisted across logout; either CTA sets it.</w:t>
             </w:r>
           </w:p>
         </w:tc>
@@ -18008,6 +18594,7 @@
             <w:r>
               <w:rPr>
                 <w:rFonts w:ascii="Arial" w:cs="Arial" w:eastAsia="Arial" w:hAnsi="Arial"/>
+                <w:strike w:val="1"/>
                 <w:sz w:val="22"/>
                 <w:szCs w:val="22"/>
                 <w:color w:val="000000"/>
@@ -18017,8 +18604,35 @@
             </w:r>
             <w:r>
               <w:rPr>
-                <w:rtl w:val="0"/>
-              </w:rPr>
+                <w:rFonts w:ascii="Arial" w:cs="Arial" w:eastAsia="Arial" w:hAnsi="Arial"/>
+                <w:sz w:val="22"/>
+                <w:szCs w:val="22"/>
+                <w:color w:val="000000"/>
+                <w:rtl w:val="0"/>
+              </w:rPr>
+              <w:t xml:space="preserve"> </w:t>
+            </w:r>
+            <w:r>
+              <w:rPr>
+                <w:i w:val="1"/>
+                <w:iCs w:val="1"/>
+                <w:rFonts w:ascii="Arial" w:cs="Arial" w:eastAsia="Arial" w:hAnsi="Arial"/>
+                <w:sz w:val="22"/>
+                <w:szCs w:val="22"/>
+                <w:color w:val="000000"/>
+                <w:rtl w:val="0"/>
+              </w:rPr>
+              <w:t xml:space="preserve">(amended, welcome redesign)</w:t>
+            </w:r>
+            <w:r>
+              <w:rPr>
+                <w:rFonts w:ascii="Arial" w:cs="Arial" w:eastAsia="Arial" w:hAnsi="Arial"/>
+                <w:sz w:val="22"/>
+                <w:szCs w:val="22"/>
+                <w:color w:val="000000"/>
+                <w:rtl w:val="0"/>
+              </w:rPr>
+              <w:t xml:space="preserve"> Build the Welcome pager at /welcome — three swipable slides (illustration / title / body) over a fixed sheet that holds the dots and two CTAs, “Get started” and “Sign in”. Both set the local flag and route to /auth.</w:t>
             </w:r>
           </w:p>
           <w:p>

</xml_diff>

<commit_message>
docs(requirements): bring the auth .docx to v1.2 (welcome redesign) (#269)
Mirrors the Requirements/auth-onboarding.md v1.2 amendment from #264 in
PadelJam_Auth_Onboarding_Requirements.docx: version line and changelog,
the amendment note, the first-install flag row, the Welcome intro, the
4.1 layout rows (incl. a new Secondary CTA row), the 4.2 card copy, AU-02
and the build prompt. Old text is struck through and tagged
"(amended, welcome redesign)", as in the .md.

Co-authored-by: Claude Opus 5.5 <noreply@anthropic.com>
</commit_message>
<xml_diff>
--- a/Requirements/PadelJam_Auth_Onboarding_Requirements.docx
+++ b/Requirements/PadelJam_Auth_Onboarding_Requirements.docx
@@ -56,12 +56,24 @@
           <w:szCs w:val="22"/>
           <w:rtl w:val="0"/>
         </w:rPr>
-        <w:t xml:space="preserve">Version 1.1 • May 2026 • Onboarding simplified — single Jammer+ gate + push prompt</w:t>
-      </w:r>
-      <w:r>
-        <w:rPr>
-          <w:rtl w:val="0"/>
-        </w:rPr>
+        <w:t xml:space="preserve">Version 1.2 • October 2026 • Welcome screen amended by the Welcome redesign (2026-10-04)</w:t>
+      </w:r>
+    </w:p>
+    <w:p>
+      <w:pPr>
+        <w:spacing w:after="200" w:lineRule="auto"/>
+        <w:rPr/>
+      </w:pPr>
+      <w:r>
+        <w:rPr>
+          <w:i w:val="1"/>
+          <w:iCs w:val="1"/>
+          <w:color w:val="777777"/>
+          <w:sz w:val="22"/>
+          <w:szCs w:val="22"/>
+          <w:rtl w:val="0"/>
+        </w:rPr>
+        <w:t xml:space="preserve">Changelog — v1.2 (2026-10-04): Welcome becomes a three-slide pager with two buttons, Get started and Sign in, both leading to Sign In / Sign Up; see the amendment note below. v1.1 (May 2026): onboarding simplified — single Jammer+ gate + push prompt.</w:t>
       </w:r>
     </w:p>
     <w:p>
@@ -95,6 +107,180 @@
         <w:rPr>
           <w:rtl w:val="0"/>
         </w:rPr>
+      </w:r>
+    </w:p>
+    <w:p>
+      <w:pPr>
+        <w:spacing w:after="200" w:lineRule="auto"/>
+        <w:rPr/>
+      </w:pPr>
+      <w:r>
+        <w:rPr>
+          <w:b w:val="1"/>
+          <w:bCs w:val="1"/>
+          <w:sz w:val="22"/>
+          <w:szCs w:val="22"/>
+          <w:rtl w:val="0"/>
+        </w:rPr>
+        <w:t xml:space="preserve">Amended 2026-10-04 by the Welcome redesign</w:t>
+      </w:r>
+      <w:r>
+        <w:rPr>
+          <w:sz w:val="22"/>
+          <w:szCs w:val="22"/>
+          <w:rtl w:val="0"/>
+        </w:rPr>
+        <w:t xml:space="preserve"> (the Welcome screens in the “PJAM - Mobile App” Figma file, which replace the placeholder carousel first built under UX-AUTH-01). Only the Welcome screen and its first-install flag change; Splash, Sign In / Sign Up and Onboarding are as before. Rows and paragraphs marked </w:t>
+      </w:r>
+      <w:r>
+        <w:rPr>
+          <w:i w:val="1"/>
+          <w:iCs w:val="1"/>
+          <w:sz w:val="22"/>
+          <w:szCs w:val="22"/>
+          <w:rtl w:val="0"/>
+        </w:rPr>
+        <w:t xml:space="preserve">(amended, welcome redesign)</w:t>
+      </w:r>
+      <w:r>
+        <w:rPr>
+          <w:sz w:val="22"/>
+          <w:szCs w:val="22"/>
+          <w:rtl w:val="0"/>
+        </w:rPr>
+        <w:t xml:space="preserve"> carry the outcome. In short:</w:t>
+      </w:r>
+    </w:p>
+    <w:p>
+      <w:pPr>
+        <w:ind w:left="360"/>
+        <w:spacing w:after="200" w:lineRule="auto"/>
+        <w:rPr/>
+      </w:pPr>
+      <w:r>
+        <w:rPr>
+          <w:sz w:val="22"/>
+          <w:szCs w:val="22"/>
+          <w:rtl w:val="0"/>
+        </w:rPr>
+        <w:t xml:space="preserve">• </w:t>
+      </w:r>
+      <w:r>
+        <w:rPr>
+          <w:b w:val="1"/>
+          <w:bCs w:val="1"/>
+          <w:sz w:val="22"/>
+          <w:szCs w:val="22"/>
+          <w:rtl w:val="0"/>
+        </w:rPr>
+        <w:t xml:space="preserve">Two buttons, not one.</w:t>
+      </w:r>
+      <w:r>
+        <w:rPr>
+          <w:sz w:val="22"/>
+          <w:szCs w:val="22"/>
+          <w:rtl w:val="0"/>
+        </w:rPr>
+        <w:t xml:space="preserve"> Under the copy, every slide shows “Get started” (primary) and “Sign in” (secondary). They are the same destination: each sets the first-install flag and replaces Welcome with the combined Sign In / Sign Up screen (“Login or Sign Up”). There is no separate returning-user screen, and Create your account is not a target because it needs a live session.</w:t>
+      </w:r>
+    </w:p>
+    <w:p>
+      <w:pPr>
+        <w:ind w:left="360"/>
+        <w:spacing w:after="200" w:lineRule="auto"/>
+        <w:rPr/>
+      </w:pPr>
+      <w:r>
+        <w:rPr>
+          <w:sz w:val="22"/>
+          <w:szCs w:val="22"/>
+          <w:rtl w:val="0"/>
+        </w:rPr>
+        <w:t xml:space="preserve">• </w:t>
+      </w:r>
+      <w:r>
+        <w:rPr>
+          <w:b w:val="1"/>
+          <w:bCs w:val="1"/>
+          <w:sz w:val="22"/>
+          <w:szCs w:val="22"/>
+          <w:rtl w:val="0"/>
+        </w:rPr>
+        <w:t xml:space="preserve">One pager, three slides.</w:t>
+      </w:r>
+      <w:r>
+        <w:rPr>
+          <w:sz w:val="22"/>
+          <w:szCs w:val="22"/>
+          <w:rtl w:val="0"/>
+        </w:rPr>
+        <w:t xml:space="preserve"> An edge-to-edge mascot illustration fills the top of the screen, under a fixed light sheet with rounded top corners. Swiping anywhere on the illustration or the copy moves to the next slide: the illustration and the copy slide together, while the sheet, the page dots and the two buttons stay put.</w:t>
+      </w:r>
+    </w:p>
+    <w:p>
+      <w:pPr>
+        <w:ind w:left="360"/>
+        <w:spacing w:after="200" w:lineRule="auto"/>
+        <w:rPr/>
+      </w:pPr>
+      <w:r>
+        <w:rPr>
+          <w:sz w:val="22"/>
+          <w:szCs w:val="22"/>
+          <w:rtl w:val="0"/>
+        </w:rPr>
+        <w:t xml:space="preserve">• </w:t>
+      </w:r>
+      <w:r>
+        <w:rPr>
+          <w:b w:val="1"/>
+          <w:bCs w:val="1"/>
+          <w:sz w:val="22"/>
+          <w:szCs w:val="22"/>
+          <w:rtl w:val="0"/>
+        </w:rPr>
+        <w:t xml:space="preserve">The copy is final</w:t>
+      </w:r>
+      <w:r>
+        <w:rPr>
+          <w:sz w:val="22"/>
+          <w:szCs w:val="22"/>
+          <w:rtl w:val="0"/>
+        </w:rPr>
+        <w:t xml:space="preserve"> (English in the Card rows of section 04; pt-PT and pt-BR live in the app’s string catalogue), replacing the “final copy TBD” placeholders.</w:t>
+      </w:r>
+    </w:p>
+    <w:p>
+      <w:pPr>
+        <w:ind w:left="360"/>
+        <w:spacing w:after="200" w:lineRule="auto"/>
+        <w:rPr/>
+      </w:pPr>
+      <w:r>
+        <w:rPr>
+          <w:sz w:val="22"/>
+          <w:szCs w:val="22"/>
+          <w:rtl w:val="0"/>
+        </w:rPr>
+        <w:t xml:space="preserve">• </w:t>
+      </w:r>
+      <w:r>
+        <w:rPr>
+          <w:b w:val="1"/>
+          <w:bCs w:val="1"/>
+          <w:sz w:val="22"/>
+          <w:szCs w:val="22"/>
+          <w:rtl w:val="0"/>
+        </w:rPr>
+        <w:t xml:space="preserve">The flag is the same flag.</w:t>
+      </w:r>
+      <w:r>
+        <w:rPr>
+          <w:sz w:val="22"/>
+          <w:szCs w:val="22"/>
+          <w:rtl w:val="0"/>
+        </w:rPr>
+        <w:t xml:space="preserve"> Only who sets it changes: either button now sets hasSeenWelcome. Devices that already have it keep skipping Welcome.</w:t>
       </w:r>
     </w:p>
     <w:tbl>
@@ -1903,12 +2089,68 @@
                 <w:szCs w:val="20"/>
                 <w:rtl w:val="0"/>
               </w:rPr>
-              <w:t xml:space="preserve">A local flag (e.g. AsyncStorage / localStorage hasSeenWelcome) is set the first time the user dismisses Welcome with Start now. Logging out does not clear it; only a full app reinstall does.</w:t>
-            </w:r>
-            <w:r>
-              <w:rPr>
-                <w:rtl w:val="0"/>
-              </w:rPr>
+              <w:t xml:space="preserve">A local flag (e.g. AsyncStorage / localStorage hasSeenWelcome) is set the first time the user dismisses Welcome with </w:t>
+            </w:r>
+            <w:r>
+              <w:rPr>
+                <w:strike w:val="1"/>
+                <w:sz w:val="20"/>
+                <w:szCs w:val="20"/>
+                <w:rtl w:val="0"/>
+              </w:rPr>
+              <w:t xml:space="preserve">Start now</w:t>
+            </w:r>
+            <w:r>
+              <w:rPr>
+                <w:sz w:val="20"/>
+                <w:szCs w:val="20"/>
+                <w:rtl w:val="0"/>
+              </w:rPr>
+              <w:t xml:space="preserve"> </w:t>
+            </w:r>
+            <w:r>
+              <w:rPr>
+                <w:i w:val="1"/>
+                <w:iCs w:val="1"/>
+                <w:sz w:val="20"/>
+                <w:szCs w:val="20"/>
+                <w:rtl w:val="0"/>
+              </w:rPr>
+              <w:t xml:space="preserve">(amended, welcome redesign)</w:t>
+            </w:r>
+            <w:r>
+              <w:rPr>
+                <w:sz w:val="20"/>
+                <w:szCs w:val="20"/>
+                <w:rtl w:val="0"/>
+              </w:rPr>
+              <w:t xml:space="preserve"> either button, Get started or Sign in. Logging out does not clear it; only a full app reinstall does.</w:t>
+            </w:r>
+            <w:r>
+              <w:rPr>
+                <w:sz w:val="20"/>
+                <w:szCs w:val="20"/>
+                <w:rtl w:val="0"/>
+              </w:rPr>
+              <w:t xml:space="preserve"> </w:t>
+            </w:r>
+            <w:r>
+              <w:rPr>
+                <w:i w:val="1"/>
+                <w:iCs w:val="1"/>
+                <w:sz w:val="20"/>
+                <w:szCs w:val="20"/>
+                <w:rtl w:val="0"/>
+              </w:rPr>
+              <w:t xml:space="preserve">(amended)</w:t>
+            </w:r>
+            <w:r>
+              <w:rPr>
+                <w:sz w:val="20"/>
+                <w:szCs w:val="20"/>
+                <w:rtl w:val="0"/>
+              </w:rPr>
+              <w:t xml:space="preserve"> If the flag cannot be saved, the button still goes on to Sign In / Sign Up; Welcome then shows again on the next launch.</w:t>
             </w:r>
           </w:p>
         </w:tc>
@@ -1944,6 +2186,7 @@
       </w:pPr>
       <w:r>
         <w:rPr>
+          <w:strike w:val="1"/>
           <w:sz w:val="22"/>
           <w:szCs w:val="22"/>
           <w:rtl w:val="0"/>
@@ -1952,8 +2195,29 @@
       </w:r>
       <w:r>
         <w:rPr>
-          <w:rtl w:val="0"/>
-        </w:rPr>
+          <w:sz w:val="22"/>
+          <w:szCs w:val="22"/>
+          <w:rtl w:val="0"/>
+        </w:rPr>
+        <w:t xml:space="preserve"> </w:t>
+      </w:r>
+      <w:r>
+        <w:rPr>
+          <w:i w:val="1"/>
+          <w:iCs w:val="1"/>
+          <w:sz w:val="22"/>
+          <w:szCs w:val="22"/>
+          <w:rtl w:val="0"/>
+        </w:rPr>
+        <w:t xml:space="preserve">(amended, welcome redesign)</w:t>
+      </w:r>
+      <w:r>
+        <w:rPr>
+          <w:sz w:val="22"/>
+          <w:szCs w:val="22"/>
+          <w:rtl w:val="0"/>
+        </w:rPr>
+        <w:t xml:space="preserve"> A short, three-slide horizontal pager that introduces the app on first install. Reached from Splash; never shown again on the device once the user has tapped Get started or Sign in (or completed a sign-in by any other means).</w:t>
       </w:r>
     </w:p>
     <w:tbl>
@@ -2093,6 +2357,7 @@
             </w:pPr>
             <w:r>
               <w:rPr>
+                <w:strike w:val="1"/>
                 <w:sz w:val="20"/>
                 <w:szCs w:val="20"/>
                 <w:rtl w:val="0"/>
@@ -2101,8 +2366,29 @@
             </w:r>
             <w:r>
               <w:rPr>
-                <w:rtl w:val="0"/>
-              </w:rPr>
+                <w:sz w:val="20"/>
+                <w:szCs w:val="20"/>
+                <w:rtl w:val="0"/>
+              </w:rPr>
+              <w:t xml:space="preserve"> </w:t>
+            </w:r>
+            <w:r>
+              <w:rPr>
+                <w:i w:val="1"/>
+                <w:iCs w:val="1"/>
+                <w:sz w:val="20"/>
+                <w:szCs w:val="20"/>
+                <w:rtl w:val="0"/>
+              </w:rPr>
+              <w:t xml:space="preserve">(amended, welcome redesign)</w:t>
+            </w:r>
+            <w:r>
+              <w:rPr>
+                <w:sz w:val="20"/>
+                <w:szCs w:val="20"/>
+                <w:rtl w:val="0"/>
+              </w:rPr>
+              <w:t xml:space="preserve"> The whole screen. The illustration runs edge to edge across the top, under the status bar. A fixed light sheet with rounded top corners rises over the lower part of the illustration and holds the copy, the page dots and the two buttons.</w:t>
             </w:r>
           </w:p>
         </w:tc>
@@ -2172,6 +2458,7 @@
             </w:pPr>
             <w:r>
               <w:rPr>
+                <w:strike w:val="1"/>
                 <w:sz w:val="20"/>
                 <w:szCs w:val="20"/>
                 <w:rtl w:val="0"/>
@@ -2180,8 +2467,29 @@
             </w:r>
             <w:r>
               <w:rPr>
-                <w:rtl w:val="0"/>
-              </w:rPr>
+                <w:sz w:val="20"/>
+                <w:szCs w:val="20"/>
+                <w:rtl w:val="0"/>
+              </w:rPr>
+              <w:t xml:space="preserve"> </w:t>
+            </w:r>
+            <w:r>
+              <w:rPr>
+                <w:i w:val="1"/>
+                <w:iCs w:val="1"/>
+                <w:sz w:val="20"/>
+                <w:szCs w:val="20"/>
+                <w:rtl w:val="0"/>
+              </w:rPr>
+              <w:t xml:space="preserve">(amended)</w:t>
+            </w:r>
+            <w:r>
+              <w:rPr>
+                <w:sz w:val="20"/>
+                <w:szCs w:val="20"/>
+                <w:rtl w:val="0"/>
+              </w:rPr>
+              <w:t xml:space="preserve"> The illustration takes the upper part of the screen; the sheet keeps its own height, so the illustration grows or shrinks with the device. It is decorative and hidden from assistive technology.</w:t>
             </w:r>
           </w:p>
         </w:tc>
@@ -2251,6 +2559,7 @@
             </w:pPr>
             <w:r>
               <w:rPr>
+                <w:strike w:val="1"/>
                 <w:sz w:val="20"/>
                 <w:szCs w:val="20"/>
                 <w:rtl w:val="0"/>
@@ -2259,8 +2568,29 @@
             </w:r>
             <w:r>
               <w:rPr>
-                <w:rtl w:val="0"/>
-              </w:rPr>
+                <w:sz w:val="20"/>
+                <w:szCs w:val="20"/>
+                <w:rtl w:val="0"/>
+              </w:rPr>
+              <w:t xml:space="preserve"> </w:t>
+            </w:r>
+            <w:r>
+              <w:rPr>
+                <w:i w:val="1"/>
+                <w:iCs w:val="1"/>
+                <w:sz w:val="20"/>
+                <w:szCs w:val="20"/>
+                <w:rtl w:val="0"/>
+              </w:rPr>
+              <w:t xml:space="preserve">(amended)</w:t>
+            </w:r>
+            <w:r>
+              <w:rPr>
+                <w:sz w:val="20"/>
+                <w:szCs w:val="20"/>
+                <w:rtl w:val="0"/>
+              </w:rPr>
+              <w:t xml:space="preserve"> A bold, centred headline of up to two lines. Two lines are always reserved, so the illustration and the buttons stay put between slides and between languages. Copy in the Card rows below.</w:t>
             </w:r>
           </w:p>
         </w:tc>
@@ -2334,12 +2664,42 @@
                 <w:szCs w:val="20"/>
                 <w:rtl w:val="0"/>
               </w:rPr>
-              <w:t xml:space="preserve">Two lines of supporting copy below the title. Final copy TBD.</w:t>
-            </w:r>
-            <w:r>
-              <w:rPr>
-                <w:rtl w:val="0"/>
-              </w:rPr>
+              <w:t xml:space="preserve">Two lines of supporting copy below the title. </w:t>
+            </w:r>
+            <w:r>
+              <w:rPr>
+                <w:strike w:val="1"/>
+                <w:sz w:val="20"/>
+                <w:szCs w:val="20"/>
+                <w:rtl w:val="0"/>
+              </w:rPr>
+              <w:t xml:space="preserve">Final copy TBD.</w:t>
+            </w:r>
+            <w:r>
+              <w:rPr>
+                <w:sz w:val="20"/>
+                <w:szCs w:val="20"/>
+                <w:rtl w:val="0"/>
+              </w:rPr>
+              <w:t xml:space="preserve"> </w:t>
+            </w:r>
+            <w:r>
+              <w:rPr>
+                <w:i w:val="1"/>
+                <w:iCs w:val="1"/>
+                <w:sz w:val="20"/>
+                <w:szCs w:val="20"/>
+                <w:rtl w:val="0"/>
+              </w:rPr>
+              <w:t xml:space="preserve">(amended)</w:t>
+            </w:r>
+            <w:r>
+              <w:rPr>
+                <w:sz w:val="20"/>
+                <w:szCs w:val="20"/>
+                <w:rtl w:val="0"/>
+              </w:rPr>
+              <w:t xml:space="preserve"> Centred, with two lines reserved as for the title. Copy in the Card rows below.</w:t>
             </w:r>
           </w:p>
         </w:tc>
@@ -2417,8 +2777,29 @@
             </w:r>
             <w:r>
               <w:rPr>
-                <w:rtl w:val="0"/>
-              </w:rPr>
+                <w:sz w:val="20"/>
+                <w:szCs w:val="20"/>
+                <w:rtl w:val="0"/>
+              </w:rPr>
+              <w:t xml:space="preserve"> </w:t>
+            </w:r>
+            <w:r>
+              <w:rPr>
+                <w:i w:val="1"/>
+                <w:iCs w:val="1"/>
+                <w:sz w:val="20"/>
+                <w:szCs w:val="20"/>
+                <w:rtl w:val="0"/>
+              </w:rPr>
+              <w:t xml:space="preserve">(amended)</w:t>
+            </w:r>
+            <w:r>
+              <w:rPr>
+                <w:sz w:val="20"/>
+                <w:szCs w:val="20"/>
+                <w:rtl w:val="0"/>
+              </w:rPr>
+              <w:t xml:space="preserve"> The dots sit between the copy and the buttons and do not move. Swiping starts anywhere on the illustration or the copy; the illustration and the copy slide together while the sheet, the dots and the buttons stay in place, and the pager does not bounce past the first or last slide.</w:t>
             </w:r>
           </w:p>
         </w:tc>
@@ -2488,6 +2869,7 @@
             </w:pPr>
             <w:r>
               <w:rPr>
+                <w:strike w:val="1"/>
                 <w:sz w:val="20"/>
                 <w:szCs w:val="20"/>
                 <w:rtl w:val="0"/>
@@ -2496,8 +2878,116 @@
             </w:r>
             <w:r>
               <w:rPr>
-                <w:rtl w:val="0"/>
-              </w:rPr>
+                <w:sz w:val="20"/>
+                <w:szCs w:val="20"/>
+                <w:rtl w:val="0"/>
+              </w:rPr>
+              <w:t xml:space="preserve"> </w:t>
+            </w:r>
+            <w:r>
+              <w:rPr>
+                <w:i w:val="1"/>
+                <w:iCs w:val="1"/>
+                <w:sz w:val="20"/>
+                <w:szCs w:val="20"/>
+                <w:rtl w:val="0"/>
+              </w:rPr>
+              <w:t xml:space="preserve">(amended, welcome redesign)</w:t>
+            </w:r>
+            <w:r>
+              <w:rPr>
+                <w:sz w:val="20"/>
+                <w:szCs w:val="20"/>
+                <w:rtl w:val="0"/>
+              </w:rPr>
+              <w:t xml:space="preserve"> A full-width “Get started” button (filled, the primary style) under the dots. Visible on every slide. Tapping it sets the first-install flag and replaces Welcome with Sign In / Sign Up, regardless of which slide is active.</w:t>
+            </w:r>
+          </w:p>
+        </w:tc>
+      </w:tr>
+      <w:tr>
+        <w:trPr>
+          <w:cantSplit w:val="0"/>
+          <w:tblHeader w:val="0"/>
+        </w:trPr>
+        <w:tc>
+          <w:tcPr>
+            <w:tcW w:w="2600.0" w:type="dxa"/>
+            <w:tcBorders>
+              <w:top w:color="cccccc" w:space="0" w:sz="4" w:val="single"/>
+              <w:left w:color="cccccc" w:space="0" w:sz="4" w:val="single"/>
+              <w:bottom w:color="cccccc" w:space="0" w:sz="4" w:val="single"/>
+              <w:right w:color="cccccc" w:space="0" w:sz="4" w:val="single"/>
+            </w:tcBorders>
+            <w:shd w:fill="fafafa" w:val="clear"/>
+            <w:tcMar>
+              <w:top w:w="80.0" w:type="dxa"/>
+              <w:left w:w="120.0" w:type="dxa"/>
+              <w:bottom w:w="80.0" w:type="dxa"/>
+              <w:right w:w="120.0" w:type="dxa"/>
+            </w:tcMar>
+          </w:tcPr>
+          <w:p>
+            <w:pPr>
+              <w:rPr/>
+            </w:pPr>
+            <w:r>
+              <w:rPr>
+                <w:b w:val="1"/>
+                <w:bCs w:val="1"/>
+                <w:sz w:val="20"/>
+                <w:szCs w:val="20"/>
+                <w:rtl w:val="0"/>
+              </w:rPr>
+              <w:t xml:space="preserve">Secondary CTA</w:t>
+            </w:r>
+            <w:r>
+              <w:rPr>
+                <w:sz w:val="20"/>
+                <w:szCs w:val="20"/>
+                <w:rtl w:val="0"/>
+              </w:rPr>
+              <w:t xml:space="preserve"> </w:t>
+            </w:r>
+            <w:r>
+              <w:rPr>
+                <w:i w:val="1"/>
+                <w:iCs w:val="1"/>
+                <w:sz w:val="20"/>
+                <w:szCs w:val="20"/>
+                <w:rtl w:val="0"/>
+              </w:rPr>
+              <w:t xml:space="preserve">(amended, welcome redesign)</w:t>
+            </w:r>
+          </w:p>
+        </w:tc>
+        <w:tc>
+          <w:tcPr>
+            <w:tcW w:w="6760.0" w:type="dxa"/>
+            <w:tcBorders>
+              <w:top w:color="cccccc" w:space="0" w:sz="4" w:val="single"/>
+              <w:left w:color="cccccc" w:space="0" w:sz="4" w:val="single"/>
+              <w:bottom w:color="cccccc" w:space="0" w:sz="4" w:val="single"/>
+              <w:right w:color="cccccc" w:space="0" w:sz="4" w:val="single"/>
+            </w:tcBorders>
+            <w:tcMar>
+              <w:top w:w="80.0" w:type="dxa"/>
+              <w:left w:w="120.0" w:type="dxa"/>
+              <w:bottom w:w="80.0" w:type="dxa"/>
+              <w:right w:w="120.0" w:type="dxa"/>
+            </w:tcMar>
+          </w:tcPr>
+          <w:p>
+            <w:pPr>
+              <w:rPr/>
+            </w:pPr>
+            <w:r>
+              <w:rPr>
+                <w:sz w:val="20"/>
+                <w:szCs w:val="20"/>
+                <w:rtl w:val="0"/>
+              </w:rPr>
+              <w:t xml:space="preserve">A full-width “Sign in” button (the secondary, light style) directly under “Get started”. Visible on every slide. It does exactly what “Get started” does: sets the first-install flag and replaces Welcome with the same combined Sign In / Sign Up screen. There is no separate returning-user screen.</w:t>
             </w:r>
           </w:p>
         </w:tc>
@@ -2651,6 +3141,7 @@
             </w:pPr>
             <w:r>
               <w:rPr>
+                <w:strike w:val="1"/>
                 <w:sz w:val="20"/>
                 <w:szCs w:val="20"/>
                 <w:rtl w:val="0"/>
@@ -2659,8 +3150,29 @@
             </w:r>
             <w:r>
               <w:rPr>
-                <w:rtl w:val="0"/>
-              </w:rPr>
+                <w:sz w:val="20"/>
+                <w:szCs w:val="20"/>
+                <w:rtl w:val="0"/>
+              </w:rPr>
+              <w:t xml:space="preserve"> </w:t>
+            </w:r>
+            <w:r>
+              <w:rPr>
+                <w:i w:val="1"/>
+                <w:iCs w:val="1"/>
+                <w:sz w:val="20"/>
+                <w:szCs w:val="20"/>
+                <w:rtl w:val="0"/>
+              </w:rPr>
+              <w:t xml:space="preserve">(amended, welcome redesign)</w:t>
+            </w:r>
+            <w:r>
+              <w:rPr>
+                <w:sz w:val="20"/>
+                <w:szCs w:val="20"/>
+                <w:rtl w:val="0"/>
+              </w:rPr>
+              <w:t xml:space="preserve"> Theme: nearby games. Title “Find games near you”. Body “Take a peek at nearby padel courts. Your next match might be closer than you think.” Illustration: a fox.</w:t>
             </w:r>
           </w:p>
         </w:tc>
@@ -2730,6 +3242,7 @@
             </w:pPr>
             <w:r>
               <w:rPr>
+                <w:strike w:val="1"/>
                 <w:sz w:val="20"/>
                 <w:szCs w:val="20"/>
                 <w:rtl w:val="0"/>
@@ -2738,8 +3251,29 @@
             </w:r>
             <w:r>
               <w:rPr>
-                <w:rtl w:val="0"/>
-              </w:rPr>
+                <w:sz w:val="20"/>
+                <w:szCs w:val="20"/>
+                <w:rtl w:val="0"/>
+              </w:rPr>
+              <w:t xml:space="preserve"> </w:t>
+            </w:r>
+            <w:r>
+              <w:rPr>
+                <w:i w:val="1"/>
+                <w:iCs w:val="1"/>
+                <w:sz w:val="20"/>
+                <w:szCs w:val="20"/>
+                <w:rtl w:val="0"/>
+              </w:rPr>
+              <w:t xml:space="preserve">(amended)</w:t>
+            </w:r>
+            <w:r>
+              <w:rPr>
+                <w:sz w:val="20"/>
+                <w:szCs w:val="20"/>
+                <w:rtl w:val="0"/>
+              </w:rPr>
+              <w:t xml:space="preserve"> Theme: creating and joining games. Title “Create or join in seconds”. Body “Start a session or reserve your spot in just a few taps. Then… relax until game time.” Illustration: a bear.</w:t>
             </w:r>
           </w:p>
         </w:tc>
@@ -2809,6 +3343,7 @@
             </w:pPr>
             <w:r>
               <w:rPr>
+                <w:strike w:val="1"/>
                 <w:sz w:val="20"/>
                 <w:szCs w:val="20"/>
                 <w:rtl w:val="0"/>
@@ -2817,8 +3352,29 @@
             </w:r>
             <w:r>
               <w:rPr>
-                <w:rtl w:val="0"/>
-              </w:rPr>
+                <w:sz w:val="20"/>
+                <w:szCs w:val="20"/>
+                <w:rtl w:val="0"/>
+              </w:rPr>
+              <w:t xml:space="preserve"> </w:t>
+            </w:r>
+            <w:r>
+              <w:rPr>
+                <w:i w:val="1"/>
+                <w:iCs w:val="1"/>
+                <w:sz w:val="20"/>
+                <w:szCs w:val="20"/>
+                <w:rtl w:val="0"/>
+              </w:rPr>
+              <w:t xml:space="preserve">(amended)</w:t>
+            </w:r>
+            <w:r>
+              <w:rPr>
+                <w:sz w:val="20"/>
+                <w:szCs w:val="20"/>
+                <w:rtl w:val="0"/>
+              </w:rPr>
+              <w:t xml:space="preserve"> Theme: the padel community. Title “Explore your padel community”. Body “Find players at your level, so you can stop carrying the whole game.” Illustration: a turtle and a rabbit.</w:t>
             </w:r>
           </w:p>
         </w:tc>
@@ -2888,6 +3444,7 @@
             </w:pPr>
             <w:r>
               <w:rPr>
+                <w:strike w:val="1"/>
                 <w:sz w:val="20"/>
                 <w:szCs w:val="20"/>
                 <w:rtl w:val="0"/>
@@ -2896,8 +3453,29 @@
             </w:r>
             <w:r>
               <w:rPr>
-                <w:rtl w:val="0"/>
-              </w:rPr>
+                <w:sz w:val="20"/>
+                <w:szCs w:val="20"/>
+                <w:rtl w:val="0"/>
+              </w:rPr>
+              <w:t xml:space="preserve"> </w:t>
+            </w:r>
+            <w:r>
+              <w:rPr>
+                <w:i w:val="1"/>
+                <w:iCs w:val="1"/>
+                <w:sz w:val="20"/>
+                <w:szCs w:val="20"/>
+                <w:rtl w:val="0"/>
+              </w:rPr>
+              <w:t xml:space="preserve">(amended, welcome redesign)</w:t>
+            </w:r>
+            <w:r>
+              <w:rPr>
+                <w:sz w:val="20"/>
+                <w:szCs w:val="20"/>
+                <w:rtl w:val="0"/>
+              </w:rPr>
+              <w:t xml:space="preserve"> The slide structure is fixed (illustration / title / body, then the dots and the two CTAs); this doc only locks the structure. The English copy above is final and ships. The Portuguese versions (pt-PT, pt-BR) are in the app’s string catalogue; the three illustrations are the mascot artwork from the design file.</w:t>
             </w:r>
           </w:p>
         </w:tc>
@@ -11054,16 +11632,29 @@
             </w:pPr>
             <w:r>
               <w:rPr>
-                <w:sz w:val="20"/>
-                <w:szCs w:val="20"/>
-                <w:rtl w:val="0"/>
-              </w:rPr>
-              <w:t xml:space="preserve">Welcome screen is shown only on first install; a 3-card horizontal carousel with “Start now” CTA.</w:t>
-            </w:r>
-            <w:r>
-              <w:rPr>
-                <w:rtl w:val="0"/>
-              </w:rPr>
+                <w:i w:val="1"/>
+                <w:iCs w:val="1"/>
+                <w:sz w:val="20"/>
+                <w:szCs w:val="20"/>
+                <w:rtl w:val="0"/>
+              </w:rPr>
+              <w:t xml:space="preserve">(amended 2026-10-04)</w:t>
+            </w:r>
+            <w:r>
+              <w:rPr>
+                <w:sz w:val="20"/>
+                <w:szCs w:val="20"/>
+                <w:rtl w:val="0"/>
+              </w:rPr>
+              <w:t xml:space="preserve"> </w:t>
+            </w:r>
+            <w:r>
+              <w:rPr>
+                <w:sz w:val="20"/>
+                <w:szCs w:val="20"/>
+                <w:rtl w:val="0"/>
+              </w:rPr>
+              <w:t xml:space="preserve">Welcome screen is shown only on first install; a 3-slide horizontal pager (illustration, title, body) over a fixed sheet with the page dots and two CTAs, “Get started” and “Sign in”, both leading to Sign In / Sign Up.</w:t>
             </w:r>
           </w:p>
         </w:tc>
@@ -11130,12 +11721,7 @@
                 <w:szCs w:val="20"/>
                 <w:rtl w:val="0"/>
               </w:rPr>
-              <w:t xml:space="preserve">Local flag persisted across logout.</w:t>
-            </w:r>
-            <w:r>
-              <w:rPr>
-                <w:rtl w:val="0"/>
-              </w:rPr>
+              <w:t xml:space="preserve">Local flag persisted across logout; either CTA sets it.</w:t>
             </w:r>
           </w:p>
         </w:tc>
@@ -18008,6 +18594,7 @@
             <w:r>
               <w:rPr>
                 <w:rFonts w:ascii="Arial" w:cs="Arial" w:eastAsia="Arial" w:hAnsi="Arial"/>
+                <w:strike w:val="1"/>
                 <w:sz w:val="22"/>
                 <w:szCs w:val="22"/>
                 <w:color w:val="000000"/>
@@ -18017,8 +18604,35 @@
             </w:r>
             <w:r>
               <w:rPr>
-                <w:rtl w:val="0"/>
-              </w:rPr>
+                <w:rFonts w:ascii="Arial" w:cs="Arial" w:eastAsia="Arial" w:hAnsi="Arial"/>
+                <w:sz w:val="22"/>
+                <w:szCs w:val="22"/>
+                <w:color w:val="000000"/>
+                <w:rtl w:val="0"/>
+              </w:rPr>
+              <w:t xml:space="preserve"> </w:t>
+            </w:r>
+            <w:r>
+              <w:rPr>
+                <w:i w:val="1"/>
+                <w:iCs w:val="1"/>
+                <w:rFonts w:ascii="Arial" w:cs="Arial" w:eastAsia="Arial" w:hAnsi="Arial"/>
+                <w:sz w:val="22"/>
+                <w:szCs w:val="22"/>
+                <w:color w:val="000000"/>
+                <w:rtl w:val="0"/>
+              </w:rPr>
+              <w:t xml:space="preserve">(amended, welcome redesign)</w:t>
+            </w:r>
+            <w:r>
+              <w:rPr>
+                <w:rFonts w:ascii="Arial" w:cs="Arial" w:eastAsia="Arial" w:hAnsi="Arial"/>
+                <w:sz w:val="22"/>
+                <w:szCs w:val="22"/>
+                <w:color w:val="000000"/>
+                <w:rtl w:val="0"/>
+              </w:rPr>
+              <w:t xml:space="preserve"> Build the Welcome pager at /welcome — three swipable slides (illustration / title / body) over a fixed sheet that holds the dots and two CTAs, “Get started” and “Sign in”. Both set the local flag and route to /auth.</w:t>
             </w:r>
           </w:p>
           <w:p>

</xml_diff>